<commit_message>
UPdate the all new files
UPdate the all new files
</commit_message>
<xml_diff>
--- a/Autodefined Products/Hotfix AutomationScript.docx
+++ b/Autodefined Products/Hotfix AutomationScript.docx
@@ -369,17 +369,7 @@
       </w:r>
     </w:p>
     <w:p>
-      <w:pPr>
-        <w:rPr>
-          <w:b/>
-          <w:bCs/>
-        </w:rPr>
-      </w:pPr>
-      <w:r>
-        <w:rPr>
-          <w:b/>
-          <w:bCs/>
-        </w:rPr>
+      <w:r>
         <w:t>Steps Performed by the Script</w:t>
       </w:r>
     </w:p>
@@ -391,17 +381,10 @@
         </w:numPr>
       </w:pPr>
       <w:r>
-        <w:t xml:space="preserve">Fetches the products already installed and prepares the </w:t>
-      </w:r>
-      <w:r>
-        <w:rPr>
-          <w:b/>
-          <w:bCs/>
-        </w:rPr>
-        <w:t>BAT file</w:t>
-      </w:r>
-      <w:r>
-        <w:t xml:space="preserve"> for the hotfix update.</w:t>
+        <w:t>Fetches the products already installed and prepares the BAT file for the hotfix update</w:t>
+      </w:r>
+      <w:r>
+        <w:t xml:space="preserve"> and output of </w:t>
       </w:r>
     </w:p>
     <w:p>
@@ -412,17 +395,13 @@
         </w:numPr>
       </w:pPr>
       <w:r>
-        <w:t xml:space="preserve">Executes the </w:t>
-      </w:r>
-      <w:r>
-        <w:rPr>
-          <w:b/>
-          <w:bCs/>
-        </w:rPr>
-        <w:t>BAT file</w:t>
-      </w:r>
-      <w:r>
-        <w:t xml:space="preserve"> for the hotfix process.</w:t>
+        <w:t xml:space="preserve">And the Bat File </w:t>
+      </w:r>
+      <w:r>
+        <w:t>is save</w:t>
+      </w:r>
+      <w:r>
+        <w:t xml:space="preserve">d in the </w:t>
       </w:r>
     </w:p>
     <w:p>
@@ -433,17 +412,7 @@
         </w:numPr>
       </w:pPr>
       <w:r>
-        <w:t xml:space="preserve">Identifies the </w:t>
-      </w:r>
-      <w:r>
-        <w:rPr>
-          <w:b/>
-          <w:bCs/>
-        </w:rPr>
-        <w:t>Server Application Manager</w:t>
-      </w:r>
-      <w:r>
-        <w:t xml:space="preserve"> and runs the log file.</w:t>
+        <w:t>Executes the BAT file for the hotfix process.</w:t>
       </w:r>
     </w:p>
     <w:p>
@@ -454,17 +423,7 @@
         </w:numPr>
       </w:pPr>
       <w:r>
-        <w:t xml:space="preserve">Stops </w:t>
-      </w:r>
-      <w:r>
-        <w:rPr>
-          <w:b/>
-          <w:bCs/>
-        </w:rPr>
-        <w:t>IIS</w:t>
-      </w:r>
-      <w:r>
-        <w:t xml:space="preserve"> services.</w:t>
+        <w:t>Identifies the Server Application Manager and runs the log file.</w:t>
       </w:r>
     </w:p>
     <w:p>
@@ -475,17 +434,7 @@
         </w:numPr>
       </w:pPr>
       <w:r>
-        <w:t xml:space="preserve">Terminates existing client processes from </w:t>
-      </w:r>
-      <w:r>
-        <w:rPr>
-          <w:b/>
-          <w:bCs/>
-        </w:rPr>
-        <w:t>Task Manager</w:t>
-      </w:r>
-      <w:r>
-        <w:t>.</w:t>
+        <w:t>Stops IIS services.</w:t>
       </w:r>
     </w:p>
     <w:p>
@@ -496,17 +445,7 @@
         </w:numPr>
       </w:pPr>
       <w:r>
-        <w:t xml:space="preserve">Stops </w:t>
-      </w:r>
-      <w:r>
-        <w:rPr>
-          <w:b/>
-          <w:bCs/>
-        </w:rPr>
-        <w:t>Phoenix instance–based services</w:t>
-      </w:r>
-      <w:r>
-        <w:t>.</w:t>
+        <w:t>Terminates existing client processes from Task Manager.</w:t>
       </w:r>
     </w:p>
     <w:p>
@@ -517,27 +456,7 @@
         </w:numPr>
       </w:pPr>
       <w:r>
-        <w:t xml:space="preserve">Executes </w:t>
-      </w:r>
-      <w:r>
-        <w:rPr>
-          <w:b/>
-          <w:bCs/>
-        </w:rPr>
-        <w:t>Log Cleaner</w:t>
-      </w:r>
-      <w:r>
-        <w:t xml:space="preserve"> and clears </w:t>
-      </w:r>
-      <w:r>
-        <w:rPr>
-          <w:b/>
-          <w:bCs/>
-        </w:rPr>
-        <w:t>Server Session data</w:t>
-      </w:r>
-      <w:r>
-        <w:t>.</w:t>
+        <w:t>Stops Phoenix instance–based services.</w:t>
       </w:r>
     </w:p>
     <w:p>
@@ -548,7 +467,7 @@
         </w:numPr>
       </w:pPr>
       <w:r>
-        <w:t>Downloads and installs the application updates.</w:t>
+        <w:t>Executes Log Cleaner and clears Server Session data.</w:t>
       </w:r>
     </w:p>
     <w:p>
@@ -559,17 +478,7 @@
         </w:numPr>
       </w:pPr>
       <w:r>
-        <w:t xml:space="preserve">Starts </w:t>
-      </w:r>
-      <w:r>
-        <w:rPr>
-          <w:b/>
-          <w:bCs/>
-        </w:rPr>
-        <w:t>IIS</w:t>
-      </w:r>
-      <w:r>
-        <w:t xml:space="preserve"> services.</w:t>
+        <w:t>Downloads and installs the application updates.</w:t>
       </w:r>
     </w:p>
     <w:p>
@@ -580,20 +489,7 @@
         </w:numPr>
       </w:pPr>
       <w:r>
-        <w:t>Initiate</w:t>
-      </w:r>
-      <w:r>
-        <w:t xml:space="preserve"> the </w:t>
-      </w:r>
-      <w:r>
-        <w:rPr>
-          <w:b/>
-          <w:bCs/>
-        </w:rPr>
-        <w:t>instance update</w:t>
-      </w:r>
-      <w:r>
-        <w:t>.</w:t>
+        <w:t>Starts IIS services.</w:t>
       </w:r>
     </w:p>
     <w:p>
@@ -604,17 +500,7 @@
         </w:numPr>
       </w:pPr>
       <w:r>
-        <w:t xml:space="preserve">Starts </w:t>
-      </w:r>
-      <w:r>
-        <w:rPr>
-          <w:b/>
-          <w:bCs/>
-        </w:rPr>
-        <w:t>Phoenix instance–based services</w:t>
-      </w:r>
-      <w:r>
-        <w:t>.</w:t>
+        <w:t>Initiate the instance update.</w:t>
       </w:r>
     </w:p>
     <w:p>
@@ -625,17 +511,7 @@
         </w:numPr>
       </w:pPr>
       <w:r>
-        <w:t xml:space="preserve">Performs </w:t>
-      </w:r>
-      <w:r>
-        <w:rPr>
-          <w:b/>
-          <w:bCs/>
-        </w:rPr>
-        <w:t>instance update verification</w:t>
-      </w:r>
-      <w:r>
-        <w:t>.</w:t>
+        <w:t>Starts Phoenix instance–based services.</w:t>
       </w:r>
     </w:p>
     <w:p>
@@ -646,17 +522,18 @@
         </w:numPr>
       </w:pPr>
       <w:r>
-        <w:t xml:space="preserve">Starts the client to initiate the </w:t>
-      </w:r>
-      <w:r>
-        <w:rPr>
-          <w:b/>
-          <w:bCs/>
-        </w:rPr>
-        <w:t>auto-update process</w:t>
-      </w:r>
-      <w:r>
-        <w:t>.</w:t>
+        <w:t>Performs instance update verification.</w:t>
+      </w:r>
+    </w:p>
+    <w:p>
+      <w:pPr>
+        <w:numPr>
+          <w:ilvl w:val="0"/>
+          <w:numId w:val="4"/>
+        </w:numPr>
+      </w:pPr>
+      <w:r>
+        <w:t>Starts the client to initiate the auto-update process.</w:t>
       </w:r>
     </w:p>
     <w:p/>
@@ -1721,6 +1598,7 @@
   <w:style w:type="character" w:default="1" w:styleId="DefaultParagraphFont">
     <w:name w:val="Default Paragraph Font"/>
     <w:uiPriority w:val="1"/>
+    <w:semiHidden/>
     <w:unhideWhenUsed/>
   </w:style>
   <w:style w:type="table" w:default="1" w:styleId="TableNormal">

</xml_diff>